<commit_message>
add xTB integrated-gradients runner; sync XAI scripts
run_ig_xtb.sh mirrors run_ig_gast.sh for the xtb_charge model on
runs_7251: flip cohort vs baseline, then IG for both models.
Uses --charge-xyz-dir data/xtb_7251 and
--token-feature-normalize-mode none, matching how xtb_charge was
trained (scripts/run_table_7251.sh:31).

Also commits the working versions of the scripts/xai/* and
src/downstream/toxicity/xai/* modules the runner depends on, the
attribution_base.py refactor, and scripts/download_checkpoints.sh.

Co-Authored-By: Claude Opus 5 <noreply@anthropic.com>
Claude-Session: https://claude.ai/code/session_01KxeX1HVwGYGvcj2hWF5HNk
</commit_message>
<xml_diff>
--- a/Claude outputs/Article2-XAI_DFT_2_revised.docx
+++ b/Claude outputs/Article2-XAI_DFT_2_revised.docx
@@ -1434,9 +1434,7 @@
       <w:r>
         <w:rPr>
           <w:rFonts w:ascii="Times New Roman" w:cs="Times New Roman" w:eastAsia="Times New Roman" w:hAnsi="Times New Roman"/>
-          <w:b/>
-          <w:bCs/>
-          <w:color w:val="1a1c1f"/>
+          <w:color w:val="1F4E79"/>
           <w:sz w:val="24"/>
           <w:szCs w:val="24"/>
           <w:rtl w:val="0"/>
@@ -2370,7 +2368,7 @@
       <w:r>
         <w:rPr>
           <w:rFonts w:ascii="Caudex" w:cs="Caudex" w:eastAsia="Caudex" w:hAnsi="Caudex"/>
-          <w:color w:val="1a1c1f"/>
+          <w:color w:val="1F4E79"/>
           <w:sz w:val="24"/>
           <w:szCs w:val="24"/>
           <w:rtl w:val="0"/>
@@ -2380,9 +2378,7 @@
       <w:r>
         <w:rPr>
           <w:rFonts w:ascii="Caudex" w:cs="Caudex" w:eastAsia="Caudex" w:hAnsi="Caudex"/>
-          <w:b/>
-          <w:bCs/>
-          <w:color w:val="1a1c1f"/>
+          <w:color w:val="1F4E79"/>
           <w:sz w:val="24"/>
           <w:szCs w:val="24"/>
           <w:rtl w:val="0"/>
@@ -2392,7 +2388,7 @@
       <w:r>
         <w:rPr>
           <w:rFonts w:ascii="Caudex" w:cs="Caudex" w:eastAsia="Caudex" w:hAnsi="Caudex"/>
-          <w:color w:val="1a1c1f"/>
+          <w:color w:val="1F4E79"/>
           <w:sz w:val="24"/>
           <w:szCs w:val="24"/>
           <w:rtl w:val="0"/>
@@ -2491,14 +2487,56 @@
       <w:r>
         <w:rPr>
           <w:rFonts w:ascii="Times New Roman" w:cs="Times New Roman" w:eastAsia="Times New Roman" w:hAnsi="Times New Roman"/>
-          <w:b/>
-          <w:bCs/>
-          <w:color w:val="1a1c1f"/>
-          <w:sz w:val="24"/>
-          <w:szCs w:val="24"/>
-          <w:rtl w:val="0"/>
-        </w:rPr>
-        <w:t xml:space="preserve">To interpret the trained models, integrated gradients was applied. The method attributes a prediction to the model inputs by integrating the gradient of the output along a straight-line path from an uninformative baseline to the actual input. For an input component i, a baseline x̄ and the target class c, the attribution was calculated as:</w:t>
+          <w:color w:val="1F4E79"/>
+          <w:sz w:val="24"/>
+          <w:szCs w:val="24"/>
+          <w:rtl w:val="0"/>
+        </w:rPr>
+        <w:t xml:space="preserve">To interpret the trained models, integrated gradients (IG) was applied. IG computes feature attributions by integrating gradients along a path from a baseline input </w:t>
+      </w:r>
+      <w:r>
+        <w:rPr>
+          <w:rFonts w:ascii="Times New Roman" w:cs="Times New Roman" w:eastAsia="Times New Roman" w:hAnsi="Times New Roman"/>
+          <w:i/>
+          <w:iCs/>
+          <w:color w:val="1F4E79"/>
+          <w:sz w:val="24"/>
+          <w:szCs w:val="24"/>
+          <w:rtl w:val="0"/>
+        </w:rPr>
+        <w:t xml:space="preserve">x′</w:t>
+      </w:r>
+      <w:r>
+        <w:rPr>
+          <w:rFonts w:ascii="Times New Roman" w:cs="Times New Roman" w:eastAsia="Times New Roman" w:hAnsi="Times New Roman"/>
+          <w:color w:val="1F4E79"/>
+          <w:sz w:val="24"/>
+          <w:szCs w:val="24"/>
+          <w:rtl w:val="0"/>
+        </w:rPr>
+        <w:t xml:space="preserve"> to the actual input </w:t>
+      </w:r>
+      <w:r>
+        <w:rPr>
+          <w:rFonts w:ascii="Times New Roman" w:cs="Times New Roman" w:eastAsia="Times New Roman" w:hAnsi="Times New Roman"/>
+          <w:i/>
+          <w:iCs/>
+          <w:color w:val="1F4E79"/>
+          <w:sz w:val="24"/>
+          <w:szCs w:val="24"/>
+          <w:rtl w:val="0"/>
+        </w:rPr>
+        <w:t xml:space="preserve">x</w:t>
+      </w:r>
+      <w:r>
+        <w:rPr>
+          <w:rFonts w:ascii="Times New Roman" w:cs="Times New Roman" w:eastAsia="Times New Roman" w:hAnsi="Times New Roman"/>
+          <w:color w:val="1F4E79"/>
+          <w:sz w:val="24"/>
+          <w:szCs w:val="24"/>
+          <w:rtl w:val="0"/>
+        </w:rPr>
+        <w:t xml:space="preserve">, defined as:</w:t>
       </w:r>
     </w:p>
     <w:p>
@@ -2536,7 +2574,7 @@
         </w:rPr>
         <w:drawing>
           <wp:inline distB="114300" distT="114300" distL="114300" distR="114300">
-            <wp:extent cx="3804292" cy="586720"/>
+            <wp:extent cx="4009059" cy="586720"/>
             <wp:effectExtent b="0" l="0" r="0" t="0"/>
             <wp:docPr id="9" name="image4.png"/>
             <a:graphic>
@@ -2556,7 +2594,7 @@
                   <pic:spPr>
                     <a:xfrm>
                       <a:off x="0" y="0"/>
-                      <a:ext cx="3804292" cy="586720"/>
+                      <a:ext cx="4009059" cy="586720"/>
                     </a:xfrm>
                     <a:prstGeom prst="rect"/>
                     <a:ln/>
@@ -2601,9 +2639,7 @@
       <w:r>
         <w:rPr>
           <w:rFonts w:ascii="Times New Roman" w:cs="Times New Roman" w:eastAsia="Times New Roman" w:hAnsi="Times New Roman"/>
-          <w:b/>
-          <w:bCs/>
-          <w:color w:val="1a1c1f"/>
+          <w:color w:val="1F4E79"/>
           <w:sz w:val="24"/>
           <w:szCs w:val="24"/>
           <w:rtl w:val="0"/>
@@ -2613,9 +2649,7 @@
       <w:r>
         <w:rPr>
           <w:rFonts w:ascii="Times New Roman" w:cs="Times New Roman" w:eastAsia="Times New Roman" w:hAnsi="Times New Roman"/>
-          <w:b/>
-          <w:bCs/>
-          <w:color w:val="1a1c1f"/>
+          <w:color w:val="1F4E79"/>
           <w:sz w:val="24"/>
           <w:szCs w:val="24"/>
           <w:rtl w:val="0"/>
@@ -2625,9 +2659,7 @@
       <w:r>
         <w:rPr>
           <w:rFonts w:ascii="Times New Roman" w:cs="Times New Roman" w:eastAsia="Times New Roman" w:hAnsi="Times New Roman"/>
-          <w:b/>
-          <w:bCs/>
-          <w:color w:val="1a1c1f"/>
+          <w:color w:val="1F4E79"/>
           <w:sz w:val="24"/>
           <w:szCs w:val="24"/>
           <w:rtl w:val="0"/>
@@ -2638,14 +2670,12 @@
       <w:r>
         <w:rPr>
           <w:rFonts w:ascii="Times New Roman" w:cs="Times New Roman" w:eastAsia="Times New Roman" w:hAnsi="Times New Roman"/>
-          <w:b/>
-          <w:bCs/>
-          <w:color w:val="1a1c1f"/>
-          <w:sz w:val="24"/>
-          <w:szCs w:val="24"/>
-          <w:rtl w:val="0"/>
-        </w:rPr>
-        <w:t xml:space="preserve"> denotes the logit of the toxic class and α parameterises the path from the baseline to the input. The integral was approximated by a Riemann sum using the midpoint rule over 64 steps. Attributions were computed with respect to the token embeddings produced by the MolEncoder embedding layer, using the same tokenizer as during training, and with respect to the token-level descriptor channels. The baseline for token embeddings was the embedding of the tokenizer padding token, and the baseline for descriptor channels was the per-feature median over the training split of the corresponding fold. A median rather than a zero baseline was used for the descriptors because an all-zero charge vector does not correspond to a molecule that can exist, so integrating through it would measure extrapolation distance rather than importance. The first and last special tokens were excluded from interpretation and their scores were set to zero. Token-level attributions were mapped back onto atoms through the tokenizer character offsets; where a token spanned several characters its value was divided equally among them, and characters that encode bonds, branches or ring closures carry no corresponding atom and therefore do not appear in the atom-level maps. Integrated gradients satisfies the completeness axiom, which requires that the attributions sum to the difference between the model output at the input and at the baseline. This identity was evaluated for every molecule and used as a convergence check on the number of integration steps.</w:t>
+          <w:color w:val="1F4E79"/>
+          <w:sz w:val="24"/>
+          <w:szCs w:val="24"/>
+          <w:rtl w:val="0"/>
+        </w:rPr>
+        <w:t xml:space="preserve"> denotes the logit of the toxic class and α parameterises the path from the baseline to the input. The integral was approximated using the midpoint rule over 64 steps. Attributions were computed with respect to the token embeddings produced by the MolEncoder embedding layer, using the same tokenizer as during training, and with respect to the token-level descriptor channels. The baseline for token embeddings was the embedding of the tokenizer padding token, and the baseline for descriptor channels was the per-feature median over the training split of the corresponding fold. A median rather than a zero baseline was used for the descriptors because an all-zero charge vector does not correspond to a molecule that can exist, so integrating through it would measure extrapolation distance rather than importance. The first and last special tokens were excluded from interpretation and their scores were set to zero. Token-level attributions were mapped back onto atoms through the tokenizer character offsets; where a token spanned several characters its value was divided equally among them, and characters that encode bonds, branches or ring closures carry no corresponding atom and therefore do not appear in the atom-level maps. Integrated gradients satisfies the completeness axiom, which requires that the attributions sum to the difference between the model output at the input and at the baseline. This identity was evaluated for every molecule and used as a convergence check on the number of integration steps.</w:t>
       </w:r>
     </w:p>
     <w:p>
@@ -2707,9 +2737,7 @@
       <w:r>
         <w:rPr>
           <w:rFonts w:ascii="Times New Roman" w:cs="Times New Roman" w:eastAsia="Times New Roman" w:hAnsi="Times New Roman"/>
-          <w:b/>
-          <w:bCs/>
-          <w:color w:val="1a1c1f"/>
+          <w:color w:val="1F4E79"/>
           <w:sz w:val="24"/>
           <w:szCs w:val="24"/>
           <w:rtl w:val="0"/>
@@ -2775,8 +2803,7 @@
       <w:r>
         <w:rPr>
           <w:rFonts w:ascii="Times New Roman" w:cs="Times New Roman" w:eastAsia="Times New Roman" w:hAnsi="Times New Roman"/>
-          <w:b/>
-          <w:bCs/>
+          <w:color w:val="1F4E79"/>
           <w:sz w:val="24"/>
           <w:szCs w:val="24"/>
           <w:rtl w:val="0"/>
@@ -2857,8 +2884,7 @@
       <w:r>
         <w:rPr>
           <w:rFonts w:ascii="Times New Roman" w:cs="Times New Roman" w:eastAsia="Times New Roman" w:hAnsi="Times New Roman"/>
-          <w:b/>
-          <w:bCs/>
+          <w:color w:val="1F4E79"/>
           <w:sz w:val="24"/>
           <w:szCs w:val="24"/>
           <w:highlight w:val="white"/>
@@ -2963,8 +2989,7 @@
       <w:r>
         <w:rPr>
           <w:rFonts w:ascii="Times New Roman" w:cs="Times New Roman" w:eastAsia="Times New Roman" w:hAnsi="Times New Roman"/>
-          <w:b/>
-          <w:bCs/>
+          <w:color w:val="1F4E79"/>
           <w:sz w:val="24"/>
           <w:szCs w:val="24"/>
           <w:highlight w:val="white"/>
@@ -2986,8 +3011,7 @@
       <w:r>
         <w:rPr>
           <w:rFonts w:ascii="Times New Roman" w:cs="Times New Roman" w:eastAsia="Times New Roman" w:hAnsi="Times New Roman"/>
-          <w:b/>
-          <w:bCs/>
+          <w:color w:val="1F4E79"/>
           <w:sz w:val="24"/>
           <w:szCs w:val="24"/>
           <w:highlight w:val="white"/>
@@ -3380,8 +3404,7 @@
       <w:r>
         <w:rPr>
           <w:rFonts w:ascii="Times New Roman" w:cs="Times New Roman" w:eastAsia="Times New Roman" w:hAnsi="Times New Roman"/>
-          <w:b/>
-          <w:bCs/>
+          <w:color w:val="1F4E79"/>
           <w:sz w:val="24"/>
           <w:szCs w:val="24"/>
           <w:rtl w:val="0"/>
@@ -3400,8 +3423,7 @@
       <w:r>
         <w:rPr>
           <w:rFonts w:ascii="Times New Roman" w:cs="Times New Roman" w:eastAsia="Times New Roman" w:hAnsi="Times New Roman"/>
-          <w:b/>
-          <w:bCs/>
+          <w:color w:val="1F4E79"/>
           <w:sz w:val="24"/>
           <w:szCs w:val="24"/>
           <w:rtl w:val="0"/>
@@ -3513,33 +3535,29 @@
       <w:r>
         <w:rPr>
           <w:rFonts w:ascii="Times New Roman" w:cs="Times New Roman" w:eastAsia="Times New Roman" w:hAnsi="Times New Roman"/>
-          <w:b/>
-          <w:bCs/>
+          <w:color w:val="1F4E79"/>
+          <w:sz w:val="24"/>
+          <w:szCs w:val="24"/>
+          <w:highlight w:val="white"/>
+          <w:rtl w:val="0"/>
+        </w:rPr>
+        <w:t xml:space="preserve">a mean ROC AUC of 0.857 ± 0.01</w:t>
+      </w:r>
+      <w:r>
+        <w:rPr>
+          <w:rFonts w:ascii="Times New Roman" w:cs="Times New Roman" w:eastAsia="Times New Roman" w:hAnsi="Times New Roman"/>
           <w:color w:val="1a1c1f"/>
           <w:sz w:val="24"/>
           <w:szCs w:val="24"/>
           <w:highlight w:val="white"/>
           <w:rtl w:val="0"/>
         </w:rPr>
-        <w:t xml:space="preserve">a mean ROC AUC of 0.857 ± 0.01</w:t>
-      </w:r>
-      <w:r>
-        <w:rPr>
-          <w:rFonts w:ascii="Times New Roman" w:cs="Times New Roman" w:eastAsia="Times New Roman" w:hAnsi="Times New Roman"/>
-          <w:color w:val="1a1c1f"/>
-          <w:sz w:val="24"/>
-          <w:szCs w:val="24"/>
-          <w:highlight w:val="white"/>
-          <w:rtl w:val="0"/>
-        </w:rPr>
         <w:t xml:space="preserve"> and </w:t>
       </w:r>
       <w:r>
         <w:rPr>
           <w:rFonts w:ascii="Times New Roman" w:cs="Times New Roman" w:eastAsia="Times New Roman" w:hAnsi="Times New Roman"/>
-          <w:b/>
-          <w:bCs/>
-          <w:color w:val="1a1c1f"/>
+          <w:color w:val="1F4E79"/>
           <w:sz w:val="24"/>
           <w:szCs w:val="24"/>
           <w:highlight w:val="white"/>
@@ -3629,27 +3647,47 @@
       <w:r>
         <w:rPr>
           <w:rFonts w:ascii="Times New Roman" w:cs="Times New Roman" w:eastAsia="Times New Roman" w:hAnsi="Times New Roman"/>
-          <w:b/>
-          <w:bCs/>
+          <w:color w:val="1F4E79"/>
+          <w:sz w:val="24"/>
+          <w:szCs w:val="24"/>
+          <w:highlight w:val="white"/>
+          <w:rtl w:val="0"/>
+        </w:rPr>
+        <w:t xml:space="preserve">OCHEM ToxAlerts tool</w:t>
+      </w:r>
+      <w:hyperlink r:id="rId51">
+        <w:r>
+          <w:rPr>
+            <w:sz w:val="24"/>
+            <w:szCs w:val="24"/>
+            <w:vertAlign w:val="superscript"/>
+            <w:rtl w:val="0"/>
+          </w:rPr>
+          <w:t xml:space="preserve">34</w:t>
+        </w:r>
+      </w:hyperlink>
+      <w:r>
+        <w:rPr>
+          <w:rFonts w:ascii="Times New Roman" w:cs="Times New Roman" w:eastAsia="Times New Roman" w:hAnsi="Times New Roman"/>
           <w:color w:val="1a1c1f"/>
           <w:sz w:val="24"/>
           <w:szCs w:val="24"/>
           <w:highlight w:val="white"/>
           <w:rtl w:val="0"/>
         </w:rPr>
-        <w:t xml:space="preserve">OCHEM ToxAlerts tool</w:t>
-      </w:r>
-      <w:hyperlink r:id="rId51">
-        <w:r>
-          <w:rPr>
-            <w:sz w:val="24"/>
-            <w:szCs w:val="24"/>
-            <w:vertAlign w:val="superscript"/>
-            <w:rtl w:val="0"/>
-          </w:rPr>
-          <w:t xml:space="preserve">34</w:t>
-        </w:r>
-      </w:hyperlink>
+        <w:t xml:space="preserve"> contains a set of toxicophores, i.e., structural alerts indicating that the compound likely has Ames toxicity, which were collected from literature (add references to respective articles). These alerts were created by the authors of the respective publications based on analysis of experimental data and their expert knowledge. For this study, the OCHEM screening results were exported as a tabular file containing per-molecule alert assignments across assay columns; this processed file is available in the project GitHub repository. For evaluation, each molecule was assigned an OCHEM-derived positive label when at least one assay column contained a value of 1, whereas molecules with only 0 or missing entries were treated as negative. Using the same stratified 5-fold partitioning scheme, the OCHEM-based assignment achieved </w:t>
+      </w:r>
+      <w:r>
+        <w:rPr>
+          <w:rFonts w:ascii="Times New Roman" w:cs="Times New Roman" w:eastAsia="Times New Roman" w:hAnsi="Times New Roman"/>
+          <w:color w:val="1F4E79"/>
+          <w:sz w:val="24"/>
+          <w:szCs w:val="24"/>
+          <w:highlight w:val="white"/>
+          <w:rtl w:val="0"/>
+        </w:rPr>
+        <w:t xml:space="preserve">a mean ROC AUC of 0.789 ± 0.01</w:t>
+      </w:r>
       <w:r>
         <w:rPr>
           <w:rFonts w:ascii="Times New Roman" w:cs="Times New Roman" w:eastAsia="Times New Roman" w:hAnsi="Times New Roman"/>
@@ -3659,38 +3697,12 @@
           <w:highlight w:val="white"/>
           <w:rtl w:val="0"/>
         </w:rPr>
-        <w:t xml:space="preserve"> contains a set of toxicophores, i.e., structural alerts indicating that the compound likely has Ames toxicity, which were collected from literature (add references to respective articles). These alerts were created by the authors of the respective publications based on analysis of experimental data and their expert knowledge. For this study, the OCHEM screening results were exported as a tabular file containing per-molecule alert assignments across assay columns; this processed file is available in the project GitHub repository. For evaluation, each molecule was assigned an OCHEM-derived positive label when at least one assay column contained a value of 1, whereas molecules with only 0 or missing entries were treated as negative. Using the same stratified 5-fold partitioning scheme, the OCHEM-based assignment achieved </w:t>
-      </w:r>
-      <w:r>
-        <w:rPr>
-          <w:rFonts w:ascii="Times New Roman" w:cs="Times New Roman" w:eastAsia="Times New Roman" w:hAnsi="Times New Roman"/>
-          <w:b/>
-          <w:bCs/>
-          <w:color w:val="1a1c1f"/>
-          <w:sz w:val="24"/>
-          <w:szCs w:val="24"/>
-          <w:highlight w:val="white"/>
-          <w:rtl w:val="0"/>
-        </w:rPr>
-        <w:t xml:space="preserve">a mean ROC AUC of 0.789 ± 0.01</w:t>
-      </w:r>
-      <w:r>
-        <w:rPr>
-          <w:rFonts w:ascii="Times New Roman" w:cs="Times New Roman" w:eastAsia="Times New Roman" w:hAnsi="Times New Roman"/>
-          <w:color w:val="1a1c1f"/>
-          <w:sz w:val="24"/>
-          <w:szCs w:val="24"/>
-          <w:highlight w:val="white"/>
-          <w:rtl w:val="0"/>
-        </w:rPr>
         <w:t xml:space="preserve"> and </w:t>
       </w:r>
       <w:r>
         <w:rPr>
           <w:rFonts w:ascii="Times New Roman" w:cs="Times New Roman" w:eastAsia="Times New Roman" w:hAnsi="Times New Roman"/>
-          <w:b/>
-          <w:bCs/>
-          <w:color w:val="1a1c1f"/>
+          <w:color w:val="1F4E79"/>
           <w:sz w:val="24"/>
           <w:szCs w:val="24"/>
           <w:highlight w:val="white"/>
@@ -3744,8 +3756,7 @@
       <w:r>
         <w:rPr>
           <w:rFonts w:ascii="Times New Roman" w:cs="Times New Roman" w:eastAsia="Times New Roman" w:hAnsi="Times New Roman"/>
-          <w:b/>
-          <w:bCs/>
+          <w:color w:val="1F4E79"/>
           <w:sz w:val="24"/>
           <w:szCs w:val="24"/>
           <w:rtl w:val="0"/>
@@ -3764,8 +3775,7 @@
       <w:r>
         <w:rPr>
           <w:rFonts w:ascii="Times New Roman" w:cs="Times New Roman" w:eastAsia="Times New Roman" w:hAnsi="Times New Roman"/>
-          <w:b/>
-          <w:bCs/>
+          <w:color w:val="1F4E79"/>
           <w:sz w:val="24"/>
           <w:szCs w:val="24"/>
           <w:rtl w:val="0"/>
@@ -3925,8 +3935,7 @@
       <w:r>
         <w:rPr>
           <w:rFonts w:ascii="Times New Roman" w:cs="Times New Roman" w:eastAsia="Times New Roman" w:hAnsi="Times New Roman"/>
-          <w:b/>
-          <w:bCs/>
+          <w:color w:val="1F4E79"/>
           <w:sz w:val="24"/>
           <w:szCs w:val="24"/>
           <w:rtl w:val="0"/>
@@ -3965,8 +3974,7 @@
       <w:r>
         <w:rPr>
           <w:rFonts w:ascii="Times New Roman" w:cs="Times New Roman" w:eastAsia="Times New Roman" w:hAnsi="Times New Roman"/>
-          <w:b/>
-          <w:bCs/>
+          <w:color w:val="1F4E79"/>
           <w:sz w:val="24"/>
           <w:szCs w:val="24"/>
           <w:rtl w:val="0"/>
@@ -3987,8 +3995,7 @@
       <w:r>
         <w:rPr>
           <w:rFonts w:ascii="Times New Roman" w:cs="Times New Roman" w:eastAsia="Times New Roman" w:hAnsi="Times New Roman"/>
-          <w:b/>
-          <w:bCs/>
+          <w:color w:val="1F4E79"/>
           <w:sz w:val="24"/>
           <w:szCs w:val="24"/>
           <w:rtl w:val="0"/>
@@ -4235,8 +4242,7 @@
       <w:r>
         <w:rPr>
           <w:rFonts w:ascii="Times New Roman" w:cs="Times New Roman" w:eastAsia="Times New Roman" w:hAnsi="Times New Roman"/>
-          <w:b/>
-          <w:bCs/>
+          <w:color w:val="1F4E79"/>
           <w:sz w:val="24"/>
           <w:szCs w:val="24"/>
           <w:rtl w:val="0"/>
@@ -6146,8 +6152,7 @@
       <w:r>
         <w:rPr>
           <w:rFonts w:ascii="Times New Roman" w:cs="Times New Roman" w:eastAsia="Times New Roman" w:hAnsi="Times New Roman"/>
-          <w:b/>
-          <w:bCs/>
+          <w:color w:val="1F4E79"/>
           <w:sz w:val="24"/>
           <w:szCs w:val="24"/>
           <w:rtl w:val="0"/>
@@ -6389,8 +6394,7 @@
       <w:r>
         <w:rPr>
           <w:rFonts w:ascii="Gungsuh" w:cs="Gungsuh" w:eastAsia="Gungsuh" w:hAnsi="Gungsuh"/>
-          <w:b/>
-          <w:bCs/>
+          <w:color w:val="1F4E79"/>
           <w:sz w:val="24"/>
           <w:szCs w:val="24"/>
           <w:rtl w:val="0"/>
@@ -6409,8 +6413,7 @@
       <w:r>
         <w:rPr>
           <w:rFonts w:ascii="Gungsuh" w:cs="Gungsuh" w:eastAsia="Gungsuh" w:hAnsi="Gungsuh"/>
-          <w:b/>
-          <w:bCs/>
+          <w:color w:val="1F4E79"/>
           <w:sz w:val="24"/>
           <w:szCs w:val="24"/>
           <w:rtl w:val="0"/>
@@ -6465,8 +6468,7 @@
       <w:r>
         <w:rPr>
           <w:rFonts w:ascii="Times New Roman" w:cs="Times New Roman" w:eastAsia="Times New Roman" w:hAnsi="Times New Roman"/>
-          <w:b/>
-          <w:bCs/>
+          <w:color w:val="1F4E79"/>
           <w:sz w:val="24"/>
           <w:szCs w:val="24"/>
         </w:rPr>
@@ -6475,8 +6477,7 @@
       <w:r>
         <w:rPr>
           <w:rFonts w:ascii="Times New Roman" w:cs="Times New Roman" w:eastAsia="Times New Roman" w:hAnsi="Times New Roman"/>
-          <w:b/>
-          <w:bCs/>
+          <w:color w:val="1F4E79"/>
           <w:sz w:val="24"/>
           <w:szCs w:val="24"/>
         </w:rPr>
@@ -6485,8 +6486,7 @@
       <w:r>
         <w:rPr>
           <w:rFonts w:ascii="Times New Roman" w:cs="Times New Roman" w:eastAsia="Times New Roman" w:hAnsi="Times New Roman"/>
-          <w:b/>
-          <w:bCs/>
+          <w:color w:val="1F4E79"/>
           <w:sz w:val="24"/>
           <w:szCs w:val="24"/>
         </w:rPr>
@@ -6495,8 +6495,7 @@
       <w:r>
         <w:rPr>
           <w:rFonts w:ascii="Times New Roman" w:cs="Times New Roman" w:eastAsia="Times New Roman" w:hAnsi="Times New Roman"/>
-          <w:b/>
-          <w:bCs/>
+          <w:color w:val="1F4E79"/>
           <w:sz w:val="24"/>
           <w:szCs w:val="24"/>
           <w:vertAlign w:val="superscript"/>
@@ -6506,8 +6505,7 @@
       <w:r>
         <w:rPr>
           <w:rFonts w:ascii="Times New Roman" w:cs="Times New Roman" w:eastAsia="Times New Roman" w:hAnsi="Times New Roman"/>
-          <w:b/>
-          <w:bCs/>
+          <w:color w:val="1F4E79"/>
           <w:sz w:val="24"/>
           <w:szCs w:val="24"/>
         </w:rPr>
@@ -6516,8 +6514,7 @@
       <w:r>
         <w:rPr>
           <w:rFonts w:ascii="Times New Roman" w:cs="Times New Roman" w:eastAsia="Times New Roman" w:hAnsi="Times New Roman"/>
-          <w:b/>
-          <w:bCs/>
+          <w:color w:val="1F4E79"/>
           <w:sz w:val="24"/>
           <w:szCs w:val="24"/>
           <w:vertAlign w:val="superscript"/>
@@ -6527,8 +6524,7 @@
       <w:r>
         <w:rPr>
           <w:rFonts w:ascii="Times New Roman" w:cs="Times New Roman" w:eastAsia="Times New Roman" w:hAnsi="Times New Roman"/>
-          <w:b/>
-          <w:bCs/>
+          <w:color w:val="1F4E79"/>
           <w:sz w:val="24"/>
           <w:szCs w:val="24"/>
         </w:rPr>
@@ -6537,8 +6533,7 @@
       <w:r>
         <w:rPr>
           <w:rFonts w:ascii="Times New Roman" w:cs="Times New Roman" w:eastAsia="Times New Roman" w:hAnsi="Times New Roman"/>
-          <w:b/>
-          <w:bCs/>
+          <w:color w:val="1F4E79"/>
           <w:sz w:val="24"/>
           <w:szCs w:val="24"/>
           <w:vertAlign w:val="superscript"/>
@@ -6548,8 +6543,7 @@
       <w:r>
         <w:rPr>
           <w:rFonts w:ascii="Times New Roman" w:cs="Times New Roman" w:eastAsia="Times New Roman" w:hAnsi="Times New Roman"/>
-          <w:b/>
-          <w:bCs/>
+          <w:color w:val="1F4E79"/>
           <w:sz w:val="24"/>
           <w:szCs w:val="24"/>
         </w:rPr>
@@ -7887,8 +7881,7 @@
       <w:r>
         <w:rPr>
           <w:rFonts w:ascii="Gungsuh" w:cs="Gungsuh" w:eastAsia="Gungsuh" w:hAnsi="Gungsuh"/>
-          <w:b/>
-          <w:bCs/>
+          <w:color w:val="1F4E79"/>
           <w:sz w:val="24"/>
           <w:szCs w:val="24"/>
           <w:rtl w:val="0"/>
@@ -7975,8 +7968,7 @@
       <w:r>
         <w:rPr>
           <w:rFonts w:ascii="Times New Roman" w:cs="Times New Roman" w:eastAsia="Times New Roman" w:hAnsi="Times New Roman"/>
-          <w:b/>
-          <w:bCs/>
+          <w:color w:val="1F4E79"/>
           <w:sz w:val="24"/>
           <w:szCs w:val="24"/>
           <w:rtl w:val="0"/>
@@ -8058,8 +8050,7 @@
       <w:r>
         <w:rPr>
           <w:rFonts w:ascii="Times New Roman" w:cs="Times New Roman" w:eastAsia="Times New Roman" w:hAnsi="Times New Roman"/>
-          <w:b/>
-          <w:bCs/>
+          <w:color w:val="1F4E79"/>
           <w:sz w:val="24"/>
           <w:szCs w:val="24"/>
         </w:rPr>
@@ -8099,6 +8090,7 @@
           <w:rFonts w:ascii="Times New Roman" w:cs="Times New Roman" w:eastAsia="Times New Roman" w:hAnsi="Times New Roman"/>
           <w:b w:val="1"/>
           <w:bCs w:val="1"/>
+          <w:color w:val="1F4E79"/>
           <w:sz w:val="32"/>
           <w:szCs w:val="32"/>
           <w:rtl w:val="0"/>
@@ -8142,8 +8134,7 @@
       <w:r>
         <w:rPr>
           <w:rFonts w:ascii="Times New Roman" w:cs="Times New Roman" w:eastAsia="Times New Roman" w:hAnsi="Times New Roman"/>
-          <w:b/>
-          <w:bCs/>
+          <w:color w:val="1F4E79"/>
           <w:sz w:val="24"/>
           <w:szCs w:val="24"/>
           <w:rtl w:val="0"/>
@@ -8177,8 +8168,7 @@
       <w:r>
         <w:rPr>
           <w:rFonts w:ascii="Times New Roman" w:cs="Times New Roman" w:eastAsia="Times New Roman" w:hAnsi="Times New Roman"/>
-          <w:b/>
-          <w:bCs/>
+          <w:color w:val="1F4E79"/>
           <w:sz w:val="24"/>
           <w:szCs w:val="24"/>
           <w:rtl w:val="0"/>

</xml_diff>